<commit_message>
made edits on slurm_aggregate_lucas.sbatch
</commit_message>
<xml_diff>
--- a/user/alper/src/Exp-3_Noisy_Student_Learning/docs/260309_Research_Progress_Notes.docx
+++ b/user/alper/src/Exp-3_Noisy_Student_Learning/docs/260309_Research_Progress_Notes.docx
@@ -68,23 +68,11 @@
       </w:pPr>
       <w:proofErr w:type="spellStart"/>
       <w:r>
-        <w:t>top</w:t>
-      </w:r>
-      <w:r>
-        <w:t>K</w:t>
+        <w:t>topK</w:t>
       </w:r>
       <w:proofErr w:type="spellEnd"/>
       <w:r>
-        <w:t xml:space="preserve"> values of 8,</w:t>
-      </w:r>
-      <w:r>
-        <w:t>9</w:t>
-      </w:r>
-      <w:r>
-        <w:t>,</w:t>
-      </w:r>
-      <w:r>
-        <w:t xml:space="preserve">10 all </w:t>
+        <w:t xml:space="preserve"> values of 8,9,10 all </w:t>
       </w:r>
       <w:proofErr w:type="gramStart"/>
       <w:r>
@@ -92,13 +80,7 @@
       </w:r>
       <w:proofErr w:type="gramEnd"/>
       <w:r>
-        <w:t xml:space="preserve"> identical scores at the same threshold</w:t>
-      </w:r>
-      <w:r>
-        <w:t>, this</w:t>
-      </w:r>
-      <w:r>
-        <w:t xml:space="preserve"> confirms most images predict fewer than 8 species above threshold.</w:t>
+        <w:t xml:space="preserve"> identical scores at the same threshold, this confirms most images predict fewer than 8 species above threshold.</w:t>
       </w:r>
     </w:p>
     <w:p>
@@ -136,6 +118,119 @@
       </w:r>
       <w:r>
         <w:t>threshold, you won't be artificially capping them.</w:t>
+      </w:r>
+    </w:p>
+    <w:p>
+      <w:pPr>
+        <w:pStyle w:val="ListParagraph"/>
+        <w:numPr>
+          <w:ilvl w:val="0"/>
+          <w:numId w:val="2"/>
+        </w:numPr>
+      </w:pPr>
+      <w:r>
+        <w:t xml:space="preserve">Results of temperature and fixed k tile filtering. </w:t>
+      </w:r>
+      <w:r>
+        <w:t>Three clear takeaways:</w:t>
+      </w:r>
+    </w:p>
+    <w:p>
+      <w:pPr>
+        <w:pStyle w:val="ListParagraph"/>
+        <w:numPr>
+          <w:ilvl w:val="1"/>
+          <w:numId w:val="2"/>
+        </w:numPr>
+      </w:pPr>
+      <w:r>
+        <w:t xml:space="preserve"> T=2.0 dominates — T=2.5 and T=3.0 are ~0.02-0.03 worse across the board. At T=3.0 the </w:t>
+      </w:r>
+      <w:proofErr w:type="spellStart"/>
+      <w:r>
+        <w:t>softmax</w:t>
+      </w:r>
+      <w:proofErr w:type="spellEnd"/>
+      <w:r>
+        <w:t xml:space="preserve"> is so flat tha</w:t>
+      </w:r>
+      <w:r>
+        <w:t xml:space="preserve">t </w:t>
+      </w:r>
+      <w:r>
+        <w:t>threshold barely matters (identical scores across thresholds).</w:t>
+      </w:r>
+    </w:p>
+    <w:p>
+      <w:pPr>
+        <w:pStyle w:val="ListParagraph"/>
+        <w:numPr>
+          <w:ilvl w:val="1"/>
+          <w:numId w:val="2"/>
+        </w:numPr>
+      </w:pPr>
+      <w:r>
+        <w:t xml:space="preserve"> k=6 is the sweet spot — classic inverted-U shape. k=4 loses real signal, k=8+ adds noise through Noisy-OR. Six</w:t>
+      </w:r>
+      <w:r>
+        <w:t xml:space="preserve"> </w:t>
+      </w:r>
+      <w:r>
+        <w:t xml:space="preserve">most-confident tiles </w:t>
+      </w:r>
+      <w:proofErr w:type="gramStart"/>
+      <w:r>
+        <w:t>is</w:t>
+      </w:r>
+      <w:proofErr w:type="gramEnd"/>
+      <w:r>
+        <w:t xml:space="preserve"> enough to capture the species while filtering out the noisy ones.</w:t>
+      </w:r>
+    </w:p>
+    <w:p>
+      <w:pPr>
+        <w:pStyle w:val="ListParagraph"/>
+        <w:numPr>
+          <w:ilvl w:val="1"/>
+          <w:numId w:val="2"/>
+        </w:numPr>
+      </w:pPr>
+      <w:r>
+        <w:t xml:space="preserve"> </w:t>
+      </w:r>
+      <w:proofErr w:type="spellStart"/>
+      <w:r>
+        <w:t>thr</w:t>
+      </w:r>
+      <w:proofErr w:type="spellEnd"/>
+      <w:r>
+        <w:t>=0.03 wins everywhere — the lower threshold lets borderline-correct species through. Higher thresholds are too</w:t>
+      </w:r>
+      <w:r>
+        <w:t xml:space="preserve"> </w:t>
+      </w:r>
+      <w:r>
+        <w:t>aggressive and cut real predictions.</w:t>
+      </w:r>
+    </w:p>
+    <w:p>
+      <w:pPr>
+        <w:pStyle w:val="ListParagraph"/>
+        <w:numPr>
+          <w:ilvl w:val="1"/>
+          <w:numId w:val="2"/>
+        </w:numPr>
+      </w:pPr>
+      <w:r>
+        <w:t xml:space="preserve">  Your optimal teacher config for Phase 3 onward: T=2.0, k=6, </w:t>
+      </w:r>
+      <w:proofErr w:type="spellStart"/>
+      <w:r>
+        <w:t>thr</w:t>
+      </w:r>
+      <w:proofErr w:type="spellEnd"/>
+      <w:r>
+        <w:t>=0.03.</w:t>
       </w:r>
     </w:p>
     <w:p>

</xml_diff>